<commit_message>
Ajout du fichier Tuto3_Servo_Moteurs.ino
</commit_message>
<xml_diff>
--- a/Arduino.docx
+++ b/Arduino.docx
@@ -196,13 +196,17 @@
         <w:spacing w:after="0" w:line="360" w:lineRule="auto"/>
         <w:rPr>
           <w:rFonts w:ascii="Times New Roman" w:hAnsi="Times New Roman" w:cs="Times New Roman"/>
-          <w:sz w:val="24"/>
-          <w:szCs w:val="24"/>
-        </w:rPr>
-      </w:pPr>
-      <w:r>
-        <w:rPr>
-          <w:rFonts w:ascii="Times New Roman" w:hAnsi="Times New Roman" w:cs="Times New Roman"/>
+          <w:b/>
+          <w:bCs/>
+          <w:sz w:val="24"/>
+          <w:szCs w:val="24"/>
+        </w:rPr>
+      </w:pPr>
+      <w:r>
+        <w:rPr>
+          <w:rFonts w:ascii="Times New Roman" w:hAnsi="Times New Roman" w:cs="Times New Roman"/>
+          <w:b/>
+          <w:bCs/>
           <w:sz w:val="24"/>
           <w:szCs w:val="24"/>
         </w:rPr>
@@ -421,6 +425,98 @@
           <w:szCs w:val="24"/>
         </w:rPr>
         <w:t>Les commentaires servent à donner des explications.</w:t>
+      </w:r>
+    </w:p>
+    <w:p>
+      <w:pPr>
+        <w:pStyle w:val="Paragraphedeliste"/>
+        <w:numPr>
+          <w:ilvl w:val="0"/>
+          <w:numId w:val="4"/>
+        </w:numPr>
+        <w:spacing w:after="0" w:line="360" w:lineRule="auto"/>
+        <w:rPr>
+          <w:rFonts w:ascii="Times New Roman" w:hAnsi="Times New Roman" w:cs="Times New Roman"/>
+          <w:sz w:val="24"/>
+          <w:szCs w:val="24"/>
+        </w:rPr>
+      </w:pPr>
+      <w:r>
+        <w:rPr>
+          <w:rFonts w:ascii="Times New Roman" w:hAnsi="Times New Roman" w:cs="Times New Roman"/>
+          <w:sz w:val="24"/>
+          <w:szCs w:val="24"/>
+        </w:rPr>
+        <w:t>Avant de mettre des commentaires</w:t>
+      </w:r>
+    </w:p>
+    <w:p>
+      <w:pPr>
+        <w:spacing w:after="0" w:line="360" w:lineRule="auto"/>
+        <w:ind w:left="360"/>
+        <w:rPr>
+          <w:rFonts w:ascii="Times New Roman" w:hAnsi="Times New Roman" w:cs="Times New Roman"/>
+          <w:sz w:val="24"/>
+          <w:szCs w:val="24"/>
+        </w:rPr>
+      </w:pPr>
+    </w:p>
+    <w:p>
+      <w:pPr>
+        <w:spacing w:after="0" w:line="360" w:lineRule="auto"/>
+        <w:rPr>
+          <w:rFonts w:ascii="Times New Roman" w:hAnsi="Times New Roman" w:cs="Times New Roman"/>
+          <w:sz w:val="24"/>
+          <w:szCs w:val="24"/>
+        </w:rPr>
+      </w:pPr>
+      <w:r>
+        <w:rPr>
+          <w:rFonts w:ascii="Times New Roman" w:hAnsi="Times New Roman" w:cs="Times New Roman"/>
+          <w:sz w:val="24"/>
+          <w:szCs w:val="24"/>
+        </w:rPr>
+        <w:t xml:space="preserve">Une librairie est un fichier qui contient </w:t>
+      </w:r>
+      <w:r>
+        <w:rPr>
+          <w:rFonts w:ascii="Times New Roman" w:hAnsi="Times New Roman" w:cs="Times New Roman"/>
+          <w:sz w:val="24"/>
+          <w:szCs w:val="24"/>
+        </w:rPr>
+        <w:t>toutes les instructions</w:t>
+      </w:r>
+      <w:r>
+        <w:rPr>
+          <w:rFonts w:ascii="Times New Roman" w:hAnsi="Times New Roman" w:cs="Times New Roman"/>
+          <w:sz w:val="24"/>
+          <w:szCs w:val="24"/>
+        </w:rPr>
+        <w:t xml:space="preserve"> que l’on peut donner à un élément particulier.</w:t>
+      </w:r>
+      <w:r>
+        <w:rPr>
+          <w:rFonts w:ascii="Times New Roman" w:hAnsi="Times New Roman" w:cs="Times New Roman"/>
+          <w:sz w:val="24"/>
+          <w:szCs w:val="24"/>
+        </w:rPr>
+        <w:t xml:space="preserve"> Par exemple la librairie &lt;servo.h&gt; est un fichier qui va permettre d’utiliser</w:t>
+      </w:r>
+      <w:r>
+        <w:rPr>
+          <w:rFonts w:ascii="Times New Roman" w:hAnsi="Times New Roman" w:cs="Times New Roman"/>
+          <w:sz w:val="24"/>
+          <w:szCs w:val="24"/>
+        </w:rPr>
+        <w:t xml:space="preserve"> le servomoteur et qui va rajouter un certains nombres de fonctions</w:t>
+      </w:r>
+      <w:r>
+        <w:rPr>
+          <w:rFonts w:ascii="Times New Roman" w:hAnsi="Times New Roman" w:cs="Times New Roman"/>
+          <w:sz w:val="24"/>
+          <w:szCs w:val="24"/>
+        </w:rPr>
+        <w:t xml:space="preserve"> qu’on va pouvoir utiliser.</w:t>
       </w:r>
     </w:p>
     <w:p>

</xml_diff>